<commit_message>
Score Grok Heavy free-form on MSG HNSW test64 pack.
IK1 10/64 (15.6%), exact 8/64, formula 19/64; unique-mol any-hit 9/53. Per-sample rationales look valid free-form. Results board and scorer script updated.
</commit_message>
<xml_diff>
--- a/paper/RESULTS_BOARD.docx
+++ b/paper/RESULTS_BOARD.docx
@@ -1171,6 +1171,230 @@
         <w:pStyle w:val="Heading2"/>
       </w:pPr>
       <w:r>
+        <w:t>D0b. Grok Heavy free-form on test64 (valid arm)</w:t>
+      </w:r>
+    </w:p>
+    <w:tbl>
+      <w:tblPr>
+        <w:tblStyle w:val="TableGrid"/>
+        <w:tblW w:type="auto" w:w="0"/>
+        <w:tblLook w:firstColumn="1" w:firstRow="1" w:lastColumn="0" w:lastRow="0" w:noHBand="0" w:noVBand="1" w:val="04A0"/>
+      </w:tblPr>
+      <w:tblGrid>
+        <w:gridCol w:w="4320"/>
+        <w:gridCol w:w="4320"/>
+      </w:tblGrid>
+      <w:tr>
+        <w:tc>
+          <w:tcPr>
+            <w:tcW w:type="dxa" w:w="4320"/>
+          </w:tcPr>
+          <w:p>
+            <w:r>
+              <w:rPr>
+                <w:b/>
+              </w:rPr>
+              <w:t>Metric</w:t>
+            </w:r>
+          </w:p>
+        </w:tc>
+        <w:tc>
+          <w:tcPr>
+            <w:tcW w:type="dxa" w:w="4320"/>
+          </w:tcPr>
+          <w:p>
+            <w:r>
+              <w:rPr>
+                <w:b/>
+              </w:rPr>
+              <w:t>Value</w:t>
+            </w:r>
+          </w:p>
+        </w:tc>
+      </w:tr>
+      <w:tr>
+        <w:tc>
+          <w:tcPr>
+            <w:tcW w:type="dxa" w:w="4320"/>
+          </w:tcPr>
+          <w:p>
+            <w:r>
+              <w:t>n</w:t>
+            </w:r>
+          </w:p>
+        </w:tc>
+        <w:tc>
+          <w:tcPr>
+            <w:tcW w:type="dxa" w:w="4320"/>
+          </w:tcPr>
+          <w:p>
+            <w:r>
+              <w:t>64 (0 missing)</w:t>
+            </w:r>
+          </w:p>
+        </w:tc>
+      </w:tr>
+      <w:tr>
+        <w:tc>
+          <w:tcPr>
+            <w:tcW w:type="dxa" w:w="4320"/>
+          </w:tcPr>
+          <w:p>
+            <w:r>
+              <w:t>IK1</w:t>
+            </w:r>
+          </w:p>
+        </w:tc>
+        <w:tc>
+          <w:tcPr>
+            <w:tcW w:type="dxa" w:w="4320"/>
+          </w:tcPr>
+          <w:p>
+            <w:r>
+              <w:t>10/64 (15.6%)</w:t>
+            </w:r>
+          </w:p>
+        </w:tc>
+      </w:tr>
+      <w:tr>
+        <w:tc>
+          <w:tcPr>
+            <w:tcW w:type="dxa" w:w="4320"/>
+          </w:tcPr>
+          <w:p>
+            <w:r>
+              <w:t>Exact SMILES</w:t>
+            </w:r>
+          </w:p>
+        </w:tc>
+        <w:tc>
+          <w:tcPr>
+            <w:tcW w:type="dxa" w:w="4320"/>
+          </w:tcPr>
+          <w:p>
+            <w:r>
+              <w:t>8/64 (12.5%)</w:t>
+            </w:r>
+          </w:p>
+        </w:tc>
+      </w:tr>
+      <w:tr>
+        <w:tc>
+          <w:tcPr>
+            <w:tcW w:type="dxa" w:w="4320"/>
+          </w:tcPr>
+          <w:p>
+            <w:r>
+              <w:t>Formula</w:t>
+            </w:r>
+          </w:p>
+        </w:tc>
+        <w:tc>
+          <w:tcPr>
+            <w:tcW w:type="dxa" w:w="4320"/>
+          </w:tcPr>
+          <w:p>
+            <w:r>
+              <w:t>19/64 (29.7%)</w:t>
+            </w:r>
+          </w:p>
+        </w:tc>
+      </w:tr>
+      <w:tr>
+        <w:tc>
+          <w:tcPr>
+            <w:tcW w:type="dxa" w:w="4320"/>
+          </w:tcPr>
+          <w:p>
+            <w:r>
+              <w:t>T ≥ 0.7 / ≥ 0.85</w:t>
+            </w:r>
+          </w:p>
+        </w:tc>
+        <w:tc>
+          <w:tcPr>
+            <w:tcW w:type="dxa" w:w="4320"/>
+          </w:tcPr>
+          <w:p>
+            <w:r>
+              <w:t>13/64 (20.3%) / 10/64 (15.6%)</w:t>
+            </w:r>
+          </w:p>
+        </w:tc>
+      </w:tr>
+      <w:tr>
+        <w:tc>
+          <w:tcPr>
+            <w:tcW w:type="dxa" w:w="4320"/>
+          </w:tcPr>
+          <w:p>
+            <w:r>
+              <w:t>Unique-mol IK1 any-hit</w:t>
+            </w:r>
+          </w:p>
+        </w:tc>
+        <w:tc>
+          <w:tcPr>
+            <w:tcW w:type="dxa" w:w="4320"/>
+          </w:tcPr>
+          <w:p>
+            <w:r>
+              <w:t>9/53 (17.0%)</w:t>
+            </w:r>
+          </w:p>
+        </w:tc>
+      </w:tr>
+      <w:tr>
+        <w:tc>
+          <w:tcPr>
+            <w:tcW w:type="dxa" w:w="4320"/>
+          </w:tcPr>
+          <w:p>
+            <w:r>
+              <w:t>Buckets</w:t>
+            </w:r>
+          </w:p>
+        </w:tc>
+        <w:tc>
+          <w:tcPr>
+            <w:tcW w:type="dxa" w:w="4320"/>
+          </w:tcPr>
+          <w:p>
+            <w:r>
+              <w:t>exact 8 · ik1≠exact 2 · similar 3 · formula-only 6 · miss 45</w:t>
+            </w:r>
+          </w:p>
+        </w:tc>
+      </w:tr>
+      <w:tr>
+        <w:tc>
+          <w:tcPr>
+            <w:tcW w:type="dxa" w:w="4320"/>
+          </w:tcPr>
+          <w:p>
+            <w:r>
+              <w:t>Free-form validity</w:t>
+            </w:r>
+          </w:p>
+        </w:tc>
+        <w:tc>
+          <w:tcPr>
+            <w:tcW w:type="dxa" w:w="4320"/>
+          </w:tcPr>
+          <w:p>
+            <w:r>
+              <w:t>Likely valid (substantive per-sample rationales)</w:t>
+            </w:r>
+          </w:p>
+        </w:tc>
+      </w:tr>
+    </w:tbl>
+    <w:p/>
+    <w:p>
+      <w:pPr>
+        <w:pStyle w:val="Heading2"/>
+      </w:pPr>
+      <w:r>
         <w:t>D1. Grok return on full 11,540 (INVALID free-form)</w:t>
       </w:r>
     </w:p>

</xml_diff>